<commit_message>
Add Chinese references to opening report
</commit_message>
<xml_diff>
--- a/开题参考/12开题报告.docx
+++ b/开题参考/12开题报告.docx
@@ -487,43 +487,43 @@
         <w:ind w:first-line="420"/>
       </w:pPr>
       <w:r>
-        <w:t>工业设备运行状态正在从传统人工巡检和事后维修，转向由多源传感器数据驱动的预测性维护与健康管理。空气压缩机、液压系统、航空发动机、轴承以及过程工业装置在运行过程中会持续产生压力、温度、电流、流量、振动、转速和阀位等多源监测信号。焦宗夏等[1]指出，液压元件及系统智能化正在向状态感知、健康评估和主动运维方向发展；王凤飞等[2]在多源信息融合剩余寿命预测中进一步说明，多传感器信息能够更充分地反映设备个体差异和退化过程。因此，工业设备状态预测的核心问题，不是将历史传感器序列简单映射为某个故障标签，而是在历史观测条件下推断未来状态、退化趋势及其不确定性。</w:t>
-      </w:r>
-    </w:p>
-    <w:p>
-      <w:pPr>
-        <w:jc w:val="both"/>
-        <w:ind w:first-line="420"/>
-      </w:pPr>
-      <w:r>
-        <w:t>工业设备监测数据通常以多变量时间序列形式存在，并具有明显的系统耦合特征。不同传感器往往从不同侧面反映同一退化过程，例如压力变化可能对应流量波动，温度升高可能伴随电流异常或振动增强。Cheng等[3]将贝叶斯思想与 Transformer 结构结合用于长时剩余寿命预测，说明深度模型能够在退化预测中表达不确定性；Wang等[4]面向随机缺失和部分故障传感器开展在线剩余寿命不确定性量化，说明缺失观测和传感器异常会直接影响预测可信度。因此，工业设备状态预测不仅需要刻画单变量随时间的变化规律，还需要学习多传感器之间的相关结构、缺失状态和联合状态演化。</w:t>
-      </w:r>
-    </w:p>
-    <w:p>
-      <w:pPr>
-        <w:jc w:val="both"/>
-        <w:ind w:first-line="420"/>
-      </w:pPr>
-      <w:r>
-        <w:t>近年来，通用时间序列预测模型为工业状态预测提供了重要方法基础。Nie等[5]提出 PatchTST，将时间序列分块后输入 Transformer，提高了长期预测能力；Wu等[6]提出 TimesNet，通过二维时序变化建模捕获周期内和周期间结构；Liu等[7]提出 iTransformer，从变量维度重构注意力机制以增强多变量建模；Zhou等[8]提出 FEDformer，通过频域增强分解处理长时依赖；Zeng等[9]则表明，在部分预测任务中简单线性结构也可以形成强基线。这些研究说明，规则采样时间序列预测已经形成较强方法体系，但其输入通常默认等间隔、同步和相对完整。</w:t>
-      </w:r>
-    </w:p>
-    <w:p>
-      <w:pPr>
-        <w:jc w:val="both"/>
-        <w:ind w:first-line="420"/>
-      </w:pPr>
-      <w:r>
-        <w:t>真实工业场景中的多传感器观测往往并不满足理想规则采样条件。不同类型传感器具有不同采样频率和通信周期，设备启停、网络延迟、局部离线、数据包丢失以及工况切换等因素，会造成观测时间不一致和局部缺失。Zhang等[10]通过图引导网络处理不规则采样多变量时间序列，Ansari等[11]利用连续—离散状态空间模型刻画不规则采样下的潜在状态演化，Yalavarthi等[12]提出 GraFITi 以图结构处理不规则采样预测，Gravina等[13]进一步将图结构与连续时间动态结合。Zhou等[14]提出 KAFNet，通过规范化预对齐方式处理不规则多变量预测，Yalavarthi等[15]提出 ProFITi，通过条件流建模不规则时间序列的概率预测。这些工作表明，异步观测不是简单缺失值填补问题，而是涉及时间戳、变量关系、查询条件和概率输出的统一建模问题。</w:t>
-      </w:r>
-    </w:p>
-    <w:p>
-      <w:pPr>
-        <w:jc w:val="both"/>
-        <w:ind w:first-line="420"/>
-      </w:pPr>
-      <w:r>
-        <w:t>与此同时，工业设备状态演化具有明显不确定性，相同工况下的设备也可能由于制造误差、历史退化路径和局部环境差异而表现出不同退化速度。Drouin等[16]提出 TACTiS，用 Transformer 与 attentional copula 建模多变量时间序列联合分布；Ashok等[17]进一步提出 TACTiS-2，以更高效的 copula 结构提升多变量概率预测可扩展性。Sun和Yu[18]研究多步时间序列预测中的 copula conformal 校准，Chen等[19]将语义特征引入时间序列 conformal 校准。Xu等[20]、Tuli等[21]和Yang等[22]分别从关联差异、Transformer 重构和对比表示角度研究多变量时间序列异常检测。Klötergens等[23]进一步探索用于不规则多变量预测的概率电路模型。由此可见，未来状态预测、概率校准和风险识别正在逐渐融合。</w:t>
+        <w:t>工业设备运行状态正在从传统人工巡检和事后维修，转向由多源传感器数据驱动的预测性维护与健康管理。空气压缩机、液压系统、航空发动机、轴承以及过程工业装置在运行过程中会持续产生压力、温度、电流、流量、振动、转速和阀位等多源监测信号。焦宗夏等[1]指出，液压元件及系统智能化正在向状态感知、健康评估和主动运维方向发展；严如强等[2]进一步指出，工业智能诊断需要把先验机理、可解释性和数据驱动模型结合起来，以提升诊断结果的可信度；王凤飞等[3]在多源信息融合剩余寿命预测中说明，多传感器信息能够更充分地反映设备个体差异和退化过程。因此，工业设备状态预测的核心问题，不是将历史传感器序列简单映射为某个故障标签，而是在历史观测条件下推断未来状态、退化趋势及其不确定性。</w:t>
+      </w:r>
+    </w:p>
+    <w:p>
+      <w:pPr>
+        <w:jc w:val="both"/>
+        <w:ind w:first-line="420"/>
+      </w:pPr>
+      <w:r>
+        <w:t>工业设备监测数据通常以多变量时间序列形式存在，并具有明显的系统耦合特征。不同传感器往往从不同侧面反映同一退化过程，例如压力变化可能对应流量波动，温度升高可能伴随电流异常或振动增强。孔雪峰等[4]围绕机械产品多变量相依退化建模进行综述，说明退化变量之间的随机相依关系会影响可靠性评估和维护决策；王宇等[5]针对非均匀监测条件下滚动轴承剩余寿命预测问题，表明监测间隔不一致会影响退化特征提取和寿命估计；陈闯等[6]综述了基于深度学习的装备剩余寿命区间预测研究，强调区间预测和不确定性表达对维护决策的重要性；庞哲楠等[7]研究了考虑不完美维修的随机退化设备剩余寿命自适应预测，说明维修行为和退化状态更新会共同改变未来寿命分布。Cheng等[8]将贝叶斯思想与 Transformer 结构结合用于长时剩余寿命预测，说明深度模型能够在退化预测中表达不确定性；Wang等[9]面向随机缺失和部分故障传感器开展在线剩余寿命不确定性量化，说明缺失观测和传感器异常会直接影响预测可信度。因此，工业设备状态预测不仅需要刻画单变量随时间的变化规律，还需要学习多传感器之间的相关结构、缺失状态和联合状态演化。</w:t>
+      </w:r>
+    </w:p>
+    <w:p>
+      <w:pPr>
+        <w:jc w:val="both"/>
+        <w:ind w:first-line="420"/>
+      </w:pPr>
+      <w:r>
+        <w:t>近年来，通用时间序列预测模型为工业状态预测提供了重要方法基础。Nie等[10]提出 PatchTST，将时间序列分块后输入 Transformer，提高了长期预测能力；Wu等[11]提出 TimesNet，通过二维时序变化建模捕获周期内和周期间结构；Liu等[12]提出 iTransformer，从变量维度重构注意力机制以增强多变量建模；Zhou等[13]提出 FEDformer，通过频域增强分解处理长时依赖；Zeng等[14]则表明，在部分预测任务中简单线性结构也可以形成强基线。这些研究说明，规则采样时间序列预测已经形成较强方法体系，但其输入通常默认等间隔、同步和相对完整。</w:t>
+      </w:r>
+    </w:p>
+    <w:p>
+      <w:pPr>
+        <w:jc w:val="both"/>
+        <w:ind w:first-line="420"/>
+      </w:pPr>
+      <w:r>
+        <w:t>真实工业场景中的多传感器观测往往并不满足理想规则采样条件。不同类型传感器具有不同采样频率和通信周期，设备启停、网络延迟、局部离线、数据包丢失以及工况切换等因素，会造成观测时间不一致和局部缺失。Zhang等[15]通过图引导网络处理不规则采样多变量时间序列，Ansari等[16]利用连续—离散状态空间模型刻画不规则采样下的潜在状态演化，Yalavarthi等[17]提出 GraFITi 以图结构处理不规则采样预测，Gravina等[18]进一步将图结构与连续时间动态结合。Zhou等[19]提出 KAFNet，通过规范化预对齐方式处理不规则多变量预测，Yalavarthi等[20]提出 ProFITi，通过条件流建模不规则时间序列的概率预测。这些工作表明，异步观测不是简单缺失值填补问题，而是涉及时间戳、变量关系、查询条件和概率输出的统一建模问题。</w:t>
+      </w:r>
+    </w:p>
+    <w:p>
+      <w:pPr>
+        <w:jc w:val="both"/>
+        <w:ind w:first-line="420"/>
+      </w:pPr>
+      <w:r>
+        <w:t>与此同时，工业设备状态演化具有明显不确定性，相同工况下的设备也可能由于制造误差、历史退化路径和局部环境差异而表现出不同退化速度。Drouin等[21]提出 TACTiS，用 Transformer 与 attentional copula 建模多变量时间序列联合分布；Ashok等[22]进一步提出 TACTiS-2，以更高效的 copula 结构提升多变量概率预测可扩展性。Sun和Yu[23]研究多步时间序列预测中的 copula conformal 校准，Chen等[24]将语义特征引入时间序列 conformal 校准。面向工业故障诊断和风险识别，杨绍普等[25]从动力学机理和故障诊断角度综述了复杂机械系统关键部件的诊断问题，林京和焦金阳[26]讨论了可解释机械智能诊断技术的发展与挑战，牟建鹏等[27]则将改进双向生成对抗网络用于工业过程故障检测。Xu等[28]、Tuli等[29]和Yang等[30]分别从关联差异、Transformer 重构和对比表示角度研究多变量时间序列异常检测。Klötergens等[31]进一步探索用于不规则多变量预测的概率电路模型。由此可见，未来状态预测、概率校准和风险识别正在逐渐融合。</w:t>
       </w:r>
     </w:p>
     <w:p>
@@ -571,16 +571,16 @@
         <w:ind w:first-line="420"/>
       </w:pPr>
       <w:r>
-        <w:t>工业设备状态预测和剩余寿命研究已经形成了较丰富的方法体系。焦宗夏等[1]围绕液压元件及系统智能化发展进行综述，指出状态感知、健康评估和智能运维是装备系统发展的重要方向。王凤飞等[2]考虑随机效应构建多源信息融合剩余寿命预测方法，研究表明设备个体差异和多源监测信息会共同影响寿命预测结果。Cheng等[3]提出 Bayesian adversarial probsparse Transformer，用于长时剩余寿命预测，并通过贝叶斯建模增强预测不确定性表达。Wang等[4]面向随机缺失和部分故障传感器提出在线剩余寿命鲁棒不确定性量化方法，表明真实工业条件下的缺失观测和传感器异常需要直接纳入模型鲁棒性评价。上述研究说明，工业设备状态预测已经从单一寿命回归逐渐转向多传感器融合、深度时序建模和不确定性量化。</w:t>
-      </w:r>
-    </w:p>
-    <w:p>
-      <w:pPr>
-        <w:jc w:val="both"/>
-        <w:ind w:first-line="420"/>
-      </w:pPr>
-      <w:r>
-        <w:t>多变量相关建模是工业状态预测中的另一重要问题。焦宗夏等[1]强调工业设备状态感知需要综合多类传感器信号，王凤飞等[2]从多源信息融合角度说明不同观测通道能够补充刻画退化过程。Cheng等[3]和Wang等[4]的研究进一步表明，仅输出确定性 RUL 或单变量风险结果难以满足复杂工业场景需要。对于空气压缩机、航空发动机和过程工业装置而言，压力、温度、电流、阀位和振动等变量之间可能存在耦合变化与协同异常，若模型只进行独立预测，就容易低估多指标同步劣化带来的风险。因此，本文将多传感器未来状态视为条件联合分布，而不是多个互不相关的单变量预测任务。</w:t>
+        <w:t>工业设备状态预测和剩余寿命研究已经形成了较丰富的方法体系。焦宗夏等[1]围绕液压元件及系统智能化发展进行综述，指出状态感知、健康评估和智能运维是装备系统发展的重要方向。王凤飞等[3]考虑随机效应构建多源信息融合剩余寿命预测方法，研究表明设备个体差异和多源监测信息会共同影响寿命预测结果。孔雪峰等[4]综述机械产品多变量相依退化建模方法，说明多指标退化过程中的相依结构会影响可靠性建模和维护策略。王宇等[5]研究非均匀监测条件下滚动轴承剩余寿命预测方法，表明不规则监测会增加寿命预测难度。陈闯等[6]综述装备剩余寿命区间预测研究，说明区间预测能够更直接服务维护决策。庞哲楠等[7]面向不完美维修下的随机退化设备提出自适应剩余寿命预测方法，强调维修活动对退化轨迹更新的影响。Cheng等[8]提出 Bayesian adversarial probsparse Transformer，用于长时剩余寿命预测，并通过贝叶斯建模增强预测不确定性表达。Wang等[9]面向随机缺失和部分故障传感器提出在线剩余寿命鲁棒不确定性量化方法，表明真实工业条件下的缺失观测和传感器异常需要直接纳入模型鲁棒性评价。上述研究说明，工业设备状态预测已经从单一寿命回归逐渐转向多传感器融合、深度时序建模和不确定性量化。</w:t>
+      </w:r>
+    </w:p>
+    <w:p>
+      <w:pPr>
+        <w:jc w:val="both"/>
+        <w:ind w:first-line="420"/>
+      </w:pPr>
+      <w:r>
+        <w:t>多变量相关建模是工业状态预测中的另一重要问题。焦宗夏等[1]强调工业设备状态感知需要综合多类传感器信号，严如强等[2]从工业智能诊断可信性角度说明先验知识和可解释机制对数据驱动模型的重要作用，孔雪峰等[4]进一步从多变量相依退化建模角度说明不同退化指标不能被简单视为独立变量。对于空气压缩机、航空发动机和过程工业装置而言，压力、温度、电流、阀位和振动等变量之间可能存在耦合变化与协同异常，若模型只进行独立预测，就容易低估多指标同步劣化带来的风险。因此，本文将多传感器未来状态视为条件联合分布，而不是多个互不相关的单变量预测任务。</w:t>
       </w:r>
     </w:p>
     <w:p>
@@ -598,16 +598,16 @@
         <w:ind w:first-line="420"/>
       </w:pPr>
       <w:r>
-        <w:t>通用时间序列预测方法为本文基线设计提供了重要依据。Nie等[5]提出 PatchTST，通过 patch 化输入提升长期预测能力；Wu等[6]提出 TimesNet，将一维时间序列转换为二维变化结构以捕获多周期模式；Liu等[7]提出 iTransformer，在变量维度进行注意力建模以增强多变量预测；Zhou等[8]提出 FEDformer，通过频域分解和频域注意力处理长序列预测；Zeng等[9]提出的研究则提醒，在部分时间序列任务中简单线性模型也具有竞争力。上述工作共同说明，规则采样长序列预测模型已经具备较强表达能力，因此本文在统一对比实验中将 PatchTST、iTransformer、TCN-Gaussian 等作为强基线，而不是只与弱基线比较。</w:t>
-      </w:r>
-    </w:p>
-    <w:p>
-      <w:pPr>
-        <w:jc w:val="both"/>
-        <w:ind w:first-line="420"/>
-      </w:pPr>
-      <w:r>
-        <w:t>但工业多传感器数据往往具有不规则时间戳和部分观测特征。Zhang等[10]提出 Graph-Guided Network，通过图结构学习不规则采样多变量时间序列中的变量关系；Ansari等[11]提出 Neural Continuous-Discrete State Space Models，以连续—离散状态空间建模不规则采样下的潜在动态；Yalavarthi等[12]提出 GraFITi，用图结构处理不规则采样时间序列预测；Gravina等[13]提出 Temporal Graph ODEs，将图神经网络与连续时间 ODE 结合以处理不规则采样时间序列。Zhou等[14]提出 KAFNet，通过规范化预对齐增强不规则多变量预测，Yalavarthi等[15]提出 ProFITi，以条件流实现不规则时间序列的概率预测。上述研究说明，异步观测建模需要同时处理时间、通道、缺失和条件查询，而不能仅依赖插值后的规则序列。</w:t>
+        <w:t>通用时间序列预测方法为本文基线设计提供了重要依据。Nie等[10]提出 PatchTST，通过 patch 化输入提升长期预测能力；Wu等[11]提出 TimesNet，将一维时间序列转换为二维变化结构以捕获多周期模式；Liu等[12]提出 iTransformer，在变量维度进行注意力建模以增强多变量预测；Zhou等[13]提出 FEDformer，通过频域分解和频域注意力处理长序列预测；Zeng等[14]提出的研究则提醒，在部分时间序列任务中简单线性模型也具有竞争力。上述工作共同说明，规则采样长序列预测模型已经具备较强表达能力，因此本文在统一对比实验中将 PatchTST、iTransformer、TCN-Gaussian 等作为强基线，而不是只与弱基线比较。</w:t>
+      </w:r>
+    </w:p>
+    <w:p>
+      <w:pPr>
+        <w:jc w:val="both"/>
+        <w:ind w:first-line="420"/>
+      </w:pPr>
+      <w:r>
+        <w:t>但工业多传感器数据往往具有不规则时间戳和部分观测特征。王宇等[5]从非均匀监测下的轴承剩余寿命预测角度说明，监测时间间隔变化会改变退化特征表达。Zhang等[15]提出 Graph-Guided Network，通过图结构学习不规则采样多变量时间序列中的变量关系；Ansari等[16]提出 Neural Continuous-Discrete State Space Models，以连续—离散状态空间建模不规则采样下的潜在动态；Yalavarthi等[17]提出 GraFITi，用图结构处理不规则采样时间序列预测；Gravina等[18]提出 Temporal Graph ODEs，将图神经网络与连续时间 ODE 结合以处理不规则采样时间序列。Zhou等[19]提出 KAFNet，通过规范化预对齐增强不规则多变量预测，Yalavarthi等[20]提出 ProFITi，以条件流实现不规则时间序列的概率预测。上述研究说明，异步观测建模需要同时处理时间、通道、缺失和条件查询，而不能仅依赖插值后的规则序列。</w:t>
       </w:r>
     </w:p>
     <w:p>
@@ -625,16 +625,16 @@
         <w:ind w:first-line="420"/>
       </w:pPr>
       <w:r>
-        <w:t>概率预测、不确定性量化与风险评估是工业预测性维护中的关键环节。Drouin等[16]提出 TACTiS，将 Transformer 与 attentional copula 结合，用于多变量时间序列的联合概率预测；Ashok等[17]提出 TACTiS-2，在保持 copula 表达能力的同时提高多变量概率预测效率。Sun和Yu[18]提出 Copula Conformal Prediction，研究多步时间序列预测中的联合区间校准；Chen等[19]提出 Conformalized Time Series with Semantic Features，进一步讨论语义特征对时间序列不确定性校准的作用。上述研究表明，概率预测不应只关注均值误差，还需要评价 NLL、CRPS、预测区间覆盖率、区间宽度和校准误差。</w:t>
-      </w:r>
-    </w:p>
-    <w:p>
-      <w:pPr>
-        <w:jc w:val="both"/>
-        <w:ind w:first-line="420"/>
-      </w:pPr>
-      <w:r>
-        <w:t>工业风险评估还需要关注异常识别和预警可用性。Xu等[20]提出 Anomaly Transformer，通过关联差异识别时间序列异常；Tuli等[21]提出 TranAD，利用 Transformer 网络进行多变量时间序列异常检测；Yang等[22]提出 DCdetector，以双注意力对比表示学习提升时间序列异常检测能力。Klötergens等[23]提出 CircuITS，将概率电路用于不规则多变量时间序列预测，为不规则场景下的概率建模提供了新的方向。这些研究为本文构建 RiskHead、风险分数、校准曲线和预警指标提供了方法参照。</w:t>
+        <w:t>概率预测、不确定性量化与风险评估是工业预测性维护中的关键环节。陈闯等[6]指出装备剩余寿命预测需要从点估计扩展到区间预测，以便表达模型预测的不确定范围。Drouin等[21]提出 TACTiS，将 Transformer 与 attentional copula 结合，用于多变量时间序列的联合概率预测；Ashok等[22]提出 TACTiS-2，在保持 copula 表达能力的同时提高多变量概率预测效率。Sun和Yu[23]提出 Copula Conformal Prediction，研究多步时间序列预测中的联合区间校准；Chen等[24]提出 Conformalized Time Series with Semantic Features，进一步讨论语义特征对时间序列不确定性校准的作用。上述研究表明，概率预测不应只关注均值误差，还需要评价 NLL、CRPS、预测区间覆盖率、区间宽度和校准误差。</w:t>
+      </w:r>
+    </w:p>
+    <w:p>
+      <w:pPr>
+        <w:jc w:val="both"/>
+        <w:ind w:first-line="420"/>
+      </w:pPr>
+      <w:r>
+        <w:t>工业风险评估还需要关注异常识别和预警可用性。杨绍普等[25]综述转向架关键运动部件动力学机理与故障诊断，说明机理知识对复杂机械系统故障识别具有重要支撑作用。林京和焦金阳[26]综述可解释机械智能诊断技术，强调诊断模型不仅要有预测性能，还需要具备可解释性和可信性。牟建鹏等[27]提出基于双向生成对抗网络的工业过程故障检测方法，并在田纳西伊斯曼过程和实际磨煤机工业过程上验证其故障检测能力。Xu等[28]提出 Anomaly Transformer，通过关联差异识别时间序列异常；Tuli等[29]提出 TranAD，利用 Transformer 网络进行多变量时间序列异常检测；Yang等[30]提出 DCdetector，以双注意力对比表示学习提升时间序列异常检测能力。Klötergens等[31]提出 CircuITS，将概率电路用于不规则多变量时间序列预测，为不规则场景下的概率建模提供了新的方向。这些研究为本文构建 RiskHead、风险分数、校准曲线和预警指标提供了方法参照。</w:t>
       </w:r>
     </w:p>
     <w:p>
@@ -2130,117 +2130,157 @@
     </w:p>
     <w:p>
       <w:r>
-        <w:t>[1] 焦宗夏, 吴帅, 李洋, 等. 液压元件及系统智能化发展现状及趋势思考[J/OL]. 机械工程学报, 2023[2026-06-11]. https://qikan.cmes.org/jxgcxb/CN/10.3901/JME.2023.20.357</w:t>
-      </w:r>
-    </w:p>
-    <w:p>
-      <w:r>
-        <w:t>[2] 王凤飞, 唐圣金, 孙晓艳, 等. 考虑随机效应的多源信息融合剩余寿命预测[J/OL]. 北京航空航天大学学报, 2023[2026-06-11]. https://bhxb.buaa.edu.cn/bhzk/article/doi/10.13700/j.bh.1001-5965.2021.0782</w:t>
-      </w:r>
-    </w:p>
-    <w:p>
-      <w:r>
-        <w:t>[3] CHENG Y, QV J, FENG K, et al. A Bayesian adversarial probsparse Transformer model for long-term remaining useful life prediction[J/OL]. Reliability Engineering &amp; System Safety, 2024[2026-06-11]. https://www.sciencedirect.com/science/article/pii/S0951832024002618</w:t>
-      </w:r>
-    </w:p>
-    <w:p>
-      <w:r>
-        <w:t>[4] WANG W, WANG Z, CAI Z, et al. Robust uncertainty quantification for online remaining useful life prediction with randomly missing and partially faulty sensor data[J/OL]. Reliability Engineering &amp; System Safety, 2025[2026-06-11]. https://www.sciencedirect.com/science/article/pii/S0951832025003783</w:t>
-      </w:r>
-    </w:p>
-    <w:p>
-      <w:r>
-        <w:t>[5] NIE Y, NGUYEN N H, SINTHONG P, et al. A Time Series is Worth 64 Words: Long-term Forecasting with Transformers[C/OL]//International Conference on Learning Representations. 2023[2026-06-11]. https://iclr.cc/virtual/2023/poster/10876</w:t>
-      </w:r>
-    </w:p>
-    <w:p>
-      <w:r>
-        <w:t>[6] WU H, HU T, LIU Y, et al. TimesNet: Temporal 2D-Variation Modeling for General Time Series Analysis[C/OL]//International Conference on Learning Representations. 2023[2026-06-11]. https://openreview.net/forum?id=ju_Uqw384Oq</w:t>
-      </w:r>
-    </w:p>
-    <w:p>
-      <w:r>
-        <w:t>[7] LIU Y, HU T, ZHANG H, et al. iTransformer: Inverted Transformers Are Effective for Time Series Forecasting[C/OL]//International Conference on Learning Representations. 2024[2026-06-11]. https://proceedings.iclr.cc/paper_files/paper/2024/hash/2ea18fdc667e0ef2ad82b2b4d65147ad-Abstract-Conference.html</w:t>
-      </w:r>
-    </w:p>
-    <w:p>
-      <w:r>
-        <w:t>[8] ZHOU T, MA Z, WEN Q, et al. FEDformer: Frequency Enhanced Decomposed Transformer for Long-term Series Forecasting[C/OL]//Proceedings of the 39th International Conference on Machine Learning. PMLR, 2022[2026-06-11]. https://proceedings.mlr.press/v162/zhou22g.html</w:t>
-      </w:r>
-    </w:p>
-    <w:p>
-      <w:r>
-        <w:t>[9] ZENG A, CHEN M, ZHANG L, et al. Are Transformers Effective for Time Series Forecasting?[C/OL]//Proceedings of the AAAI Conference on Artificial Intelligence. 2023[2026-06-11]. https://ojs.aaai.org/index.php/AAAI/article/view/26317</w:t>
-      </w:r>
-    </w:p>
-    <w:p>
-      <w:r>
-        <w:t>[10] ZHANG X, ZEMAN M, TSILIGKARIDIS T, et al. Graph-Guided Network for Irregularly Sampled Multivariate Time Series[C/OL]//International Conference on Learning Representations. 2022[2026-06-11]. https://www.ll.mit.edu/r-d/publications/graph-guided-network-irregularly-sampled-multivariate-time-series</w:t>
-      </w:r>
-    </w:p>
-    <w:p>
-      <w:r>
-        <w:t>[11] ANSARI A F, HENG A, LIM A, et al. Neural Continuous-Discrete State Space Models for Irregularly-Sampled Time Series[C/OL]//Proceedings of the 40th International Conference on Machine Learning. PMLR, 2023[2026-06-11]. https://proceedings.mlr.press/v202/ansari23a.html</w:t>
-      </w:r>
-    </w:p>
-    <w:p>
-      <w:r>
-        <w:t>[12] YALAVARTHI V K, MADHUSUDHANAN K, SCHOLZ R, et al. GraFITi: Graphs for Forecasting Irregularly Sampled Time Series[C/OL]//Proceedings of the AAAI Conference on Artificial Intelligence. 2024[2026-06-11]. https://mlanthology.org/aaai/2024/yalavarthi2024aaai-grafiti/</w:t>
-      </w:r>
-    </w:p>
-    <w:p>
-      <w:r>
-        <w:t>[13] GRAVINA A, ZAMBON D, BACCIU D, et al. Temporal Graph ODEs for Irregularly-Sampled Time Series[C/OL]//Proceedings of the Thirty-Third International Joint Conference on Artificial Intelligence. 2024[2026-06-11]. https://www.ijcai.org/proceedings/2024/445</w:t>
-      </w:r>
-    </w:p>
-    <w:p>
-      <w:r>
-        <w:t>[14] ZHOU Z, HUANG Y, WANG Y, et al. Revitalizing Canonical Pre-Alignment for Irregular Multivariate Time Series Forecasting[C/OL]. AAAI Conference on Artificial Intelligence, 2026 accepted; arXiv:2508.01971, 2025[2026-06-11]. https://arxiv.org/abs/2508.01971</w:t>
-      </w:r>
-    </w:p>
-    <w:p>
-      <w:r>
-        <w:t>[15] YALAVARTHI V K, SCHOLZ R, BORN S, et al. Probabilistic Forecasting of Irregular Time Series via Conditional Flows[EB/OL]. arXiv:2402.06293, 2024[2026-06-11]. https://arxiv.org/abs/2402.06293</w:t>
-      </w:r>
-    </w:p>
-    <w:p>
-      <w:r>
-        <w:t>[16] DROUIN A, MARCOTTE E, CHAPADOS N. TACTiS: Transformer-Attentional Copulas for Time Series[C/OL]//Proceedings of the 39th International Conference on Machine Learning. PMLR, 2022[2026-06-11]. https://proceedings.mlr.press/v162/drouin22a.html</w:t>
-      </w:r>
-    </w:p>
-    <w:p>
-      <w:r>
-        <w:t>[17] ASHOK A, MARCOTTE E, ZANTEDESCHI V, et al. TACTiS-2: Better, Faster, Simpler Attentional Copulas for Multivariate Time Series[C/OL]//International Conference on Learning Representations. 2024[2026-06-11]. https://arxiv.org/abs/2310.01327</w:t>
-      </w:r>
-    </w:p>
-    <w:p>
-      <w:r>
-        <w:t>[18] SUN S, YU R. Copula Conformal Prediction for Multi-step Time Series Forecasting[C/OL]//International Conference on Learning Representations. 2024[2026-06-11]. https://proceedings.iclr.cc/paper_files/paper/2024/hash/8707924df5e207fa496f729f49069446-Abstract-Conference.html</w:t>
-      </w:r>
-    </w:p>
-    <w:p>
-      <w:r>
-        <w:t>[19] CHEN B, REN Z, CHENG L. Conformalized Time Series with Semantic Features[C/OL]//Advances in Neural Information Processing Systems. 2024[2026-06-11]. https://proceedings.neurips.cc/paper_files/paper/2024/hash/dbfb7b1443583fc7ab87e8b1b4f48c9c-Abstract-Conference.html</w:t>
-      </w:r>
-    </w:p>
-    <w:p>
-      <w:r>
-        <w:t>[20] XU J, WU H, WANG J, et al. Anomaly Transformer: Time Series Anomaly Detection with Association Discrepancy[C/OL]//International Conference on Learning Representations. 2022[2026-06-11]. https://openreview.net/forum?id=LzQQ89U1qm_</w:t>
-      </w:r>
-    </w:p>
-    <w:p>
-      <w:r>
-        <w:t>[21] TULI S, CASALE G, JENNINGS N R. TranAD: Deep Transformer Networks for Anomaly Detection in Multivariate Time Series Data[J/OL]. Proceedings of the VLDB Endowment, 2022[2026-06-11]. https://www.vldb.org/pvldb/vol15/p1201-tuli.pdf</w:t>
-      </w:r>
-    </w:p>
-    <w:p>
-      <w:r>
-        <w:t>[22] YANG Y, ZHANG C, ZHOU T, et al. DCdetector: Dual Attention Contrastive Representation Learning for Time Series Anomaly Detection[C/OL]//ACM SIGKDD Conference on Knowledge Discovery and Data Mining. 2023[2026-06-11]. https://arxiv.org/abs/2306.10347</w:t>
-      </w:r>
-    </w:p>
-    <w:p>
-      <w:r>
-        <w:t>[23] KLOETERGENS J, TALEBZADEH S, PATIL V, et al. CircuITS: Probabilistic Circuits for Irregular Multivariate Time Series Forecasting[EB/OL]. arXiv:2605.01764, 2026[2026-06-11]. https://arxiv.org/abs/2605.01764</w:t>
+        <w:t>[1] 焦宗夏, 吴帅, 李洋, 等. 液压元件及系统智能化发展现状及趋势思考[J/OL]. 机械工程学报, 2023, 59(20): 357-384[2026-06-11]. https://qikan.cmes.org/jxgcxb/CN/10.3901/JME.2023.20.357</w:t>
+      </w:r>
+    </w:p>
+    <w:p>
+      <w:r>
+        <w:t>[2] 严如强, 商佐港, 王志颖, 等. 可解释人工智能在工业智能诊断中的挑战和机遇: 先验赋能[J/OL]. 机械工程学报, 2024, 60(12): 1-20[2026-06-11]. https://qikan.cmes.org/jxgcxb/CN/10.3901/JME.2024.12.001</w:t>
+      </w:r>
+    </w:p>
+    <w:p>
+      <w:r>
+        <w:t>[3] 王凤飞, 唐圣金, 孙晓艳, 等. 考虑随机效应的多源信息融合剩余寿命预测[J/OL]. 北京航空航天大学学报, 2023, 49(11): 3075-3085[2026-06-11]. https://bhxb.buaa.edu.cn/bhzk/article/doi/10.13700/j.bh.1001-5965.2021.0782</w:t>
+      </w:r>
+    </w:p>
+    <w:p>
+      <w:r>
+        <w:t>[4] 孔雪峰, 潘骏, 钱萍, 等. 机械产品多变量相依退化建模方法研究综述[J/OL]. 机械工程学报, 2023, 59(20): 470-488[2026-06-11]. https://qikan.cmes.org/jxgcxb/CN/10.3901/JME.2023.20.470</w:t>
+      </w:r>
+    </w:p>
+    <w:p>
+      <w:r>
+        <w:t>[5] 王宇, 刘秋发, 彭一真. 非均匀监测条件下滚动轴承剩余寿命预测方法[J/OL]. 机械工程学报, 2023, 59(23): 96-104[2026-06-11]. https://qikan.cmes.org/jxgcxb/CN/10.3901/JME.2023.23.096</w:t>
+      </w:r>
+    </w:p>
+    <w:p>
+      <w:r>
+        <w:t>[6] 陈闯, 李先锋, 史建涛. 基于深度学习的装备剩余寿命区间预测研究进展[J/OL]. 工程科学学报, 2024, 46(4): 723-734[2026-06-11]. https://cje.ustb.edu.cn/cn/article/doi/10.13374/j.issn2095-9389.2023.06.19.003</w:t>
+      </w:r>
+    </w:p>
+    <w:p>
+      <w:r>
+        <w:t>[7] 庞哲楠, 裴洪, 李天梅, 等. 考虑不完美维修的随机退化设备剩余寿命自适应预测方法[J/OL]. 机械工程学报, 2023, 59(2): 14-29[2026-06-11]. https://qikan.cmes.org/jxgcxb/CN/10.3901/JME.2023.02.014</w:t>
+      </w:r>
+    </w:p>
+    <w:p>
+      <w:r>
+        <w:t>[8] CHENG Y, QV J, FENG K, et al. A Bayesian adversarial probsparse Transformer model for long-term remaining useful life prediction[J/OL]. Reliability Engineering &amp; System Safety, 2024[2026-06-11]. https://www.sciencedirect.com/science/article/pii/S0951832024002618</w:t>
+      </w:r>
+    </w:p>
+    <w:p>
+      <w:r>
+        <w:t>[9] WANG W, WANG Z, CAI Z, et al. Robust uncertainty quantification for online remaining useful life prediction with randomly missing and partially faulty sensor data[J/OL]. Reliability Engineering &amp; System Safety, 2025[2026-06-11]. https://www.sciencedirect.com/science/article/pii/S0951832025003783</w:t>
+      </w:r>
+    </w:p>
+    <w:p>
+      <w:r>
+        <w:t>[10] NIE Y, NGUYEN N H, SINTHONG P, et al. A Time Series is Worth 64 Words: Long-term Forecasting with Transformers[C/OL]//International Conference on Learning Representations. 2023[2026-06-11]. https://iclr.cc/virtual/2023/poster/10876</w:t>
+      </w:r>
+    </w:p>
+    <w:p>
+      <w:r>
+        <w:t>[11] WU H, HU T, LIU Y, et al. TimesNet: Temporal 2D-Variation Modeling for General Time Series Analysis[C/OL]//International Conference on Learning Representations. 2023[2026-06-11]. https://openreview.net/forum?id=ju_Uqw384Oq</w:t>
+      </w:r>
+    </w:p>
+    <w:p>
+      <w:r>
+        <w:t>[12] LIU Y, HU T, ZHANG H, et al. iTransformer: Inverted Transformers Are Effective for Time Series Forecasting[C/OL]//International Conference on Learning Representations. 2024[2026-06-11]. https://proceedings.iclr.cc/paper_files/paper/2024/hash/2ea18fdc667e0ef2ad82b2b4d65147ad-Abstract-Conference.html</w:t>
+      </w:r>
+    </w:p>
+    <w:p>
+      <w:r>
+        <w:t>[13] ZHOU T, MA Z, WEN Q, et al. FEDformer: Frequency Enhanced Decomposed Transformer for Long-term Series Forecasting[C/OL]//Proceedings of the 39th International Conference on Machine Learning. PMLR, 2022[2026-06-11]. https://proceedings.mlr.press/v162/zhou22g.html</w:t>
+      </w:r>
+    </w:p>
+    <w:p>
+      <w:r>
+        <w:t>[14] ZENG A, CHEN M, ZHANG L, et al. Are Transformers Effective for Time Series Forecasting?[C/OL]//Proceedings of the AAAI Conference on Artificial Intelligence. 2023[2026-06-11]. https://ojs.aaai.org/index.php/AAAI/article/view/26317</w:t>
+      </w:r>
+    </w:p>
+    <w:p>
+      <w:r>
+        <w:t>[15] ZHANG X, ZEMAN M, TSILIGKARIDIS T, et al. Graph-Guided Network for Irregularly Sampled Multivariate Time Series[C/OL]//International Conference on Learning Representations. 2022[2026-06-11]. https://www.ll.mit.edu/r-d/publications/graph-guided-network-irregularly-sampled-multivariate-time-series</w:t>
+      </w:r>
+    </w:p>
+    <w:p>
+      <w:r>
+        <w:t>[16] ANSARI A F, HENG A, LIM A, et al. Neural Continuous-Discrete State Space Models for Irregularly-Sampled Time Series[C/OL]//Proceedings of the 40th International Conference on Machine Learning. PMLR, 2023[2026-06-11]. https://proceedings.mlr.press/v202/ansari23a.html</w:t>
+      </w:r>
+    </w:p>
+    <w:p>
+      <w:r>
+        <w:t>[17] YALAVARTHI V K, MADHUSUDHANAN K, SCHOLZ R, et al. GraFITi: Graphs for Forecasting Irregularly Sampled Time Series[C/OL]//Proceedings of the AAAI Conference on Artificial Intelligence. 2024[2026-06-11]. https://mlanthology.org/aaai/2024/yalavarthi2024aaai-grafiti/</w:t>
+      </w:r>
+    </w:p>
+    <w:p>
+      <w:r>
+        <w:t>[18] GRAVINA A, ZAMBON D, BACCIU D, et al. Temporal Graph ODEs for Irregularly-Sampled Time Series[C/OL]//Proceedings of the Thirty-Third International Joint Conference on Artificial Intelligence. 2024[2026-06-11]. https://www.ijcai.org/proceedings/2024/445</w:t>
+      </w:r>
+    </w:p>
+    <w:p>
+      <w:r>
+        <w:t>[19] ZHOU Z, HUANG Y, WANG Y, et al. Revitalizing Canonical Pre-Alignment for Irregular Multivariate Time Series Forecasting[C/OL]. AAAI Conference on Artificial Intelligence, 2026 accepted; arXiv:2508.01971, 2025[2026-06-11]. https://arxiv.org/abs/2508.01971</w:t>
+      </w:r>
+    </w:p>
+    <w:p>
+      <w:r>
+        <w:t>[20] YALAVARTHI V K, SCHOLZ R, BORN S, et al. Probabilistic Forecasting of Irregular Time Series via Conditional Flows[EB/OL]. arXiv:2402.06293, 2024[2026-06-11]. https://arxiv.org/abs/2402.06293</w:t>
+      </w:r>
+    </w:p>
+    <w:p>
+      <w:r>
+        <w:t>[21] DROUIN A, MARCOTTE E, CHAPADOS N. TACTiS: Transformer-Attentional Copulas for Time Series[C/OL]//Proceedings of the 39th International Conference on Machine Learning. PMLR, 2022[2026-06-11]. https://proceedings.mlr.press/v162/drouin22a.html</w:t>
+      </w:r>
+    </w:p>
+    <w:p>
+      <w:r>
+        <w:t>[22] ASHOK A, MARCOTTE E, ZANTEDESCHI V, et al. TACTiS-2: Better, Faster, Simpler Attentional Copulas for Multivariate Time Series[C/OL]//International Conference on Learning Representations. 2024[2026-06-11]. https://arxiv.org/abs/2310.01327</w:t>
+      </w:r>
+    </w:p>
+    <w:p>
+      <w:r>
+        <w:t>[23] SUN S, YU R. Copula Conformal Prediction for Multi-step Time Series Forecasting[C/OL]//International Conference on Learning Representations. 2024[2026-06-11]. https://proceedings.iclr.cc/paper_files/paper/2024/hash/8707924df5e207fa496f729f49069446-Abstract-Conference.html</w:t>
+      </w:r>
+    </w:p>
+    <w:p>
+      <w:r>
+        <w:t>[24] CHEN B, REN Z, CHENG L. Conformalized Time Series with Semantic Features[C/OL]//Advances in Neural Information Processing Systems. 2024[2026-06-11]. https://proceedings.neurips.cc/paper_files/paper/2024/hash/dbfb7b1443583fc7ab87e8b1b4f48c9c-Abstract-Conference.html</w:t>
+      </w:r>
+    </w:p>
+    <w:p>
+      <w:r>
+        <w:t>[25] 杨绍普, 顾晓辉, 刘永强, 等. 转向架关键运动部件动力学机理与故障诊断研究综述[J/OL]. 机械工程学报, 2023, 59(20): 225-243[2026-06-11]. https://qikan.cmes.org/jxgcxb/CN/10.3901/JME.2023.20.225</w:t>
+      </w:r>
+    </w:p>
+    <w:p>
+      <w:r>
+        <w:t>[26] 林京, 焦金阳. 可解释机械智能诊断技术的研究进展与挑战[J/OL]. 机械工程学报, 2023, 59(20): 215-224[2026-06-11]. https://qikan.cmes.org/jxgcxb/CN/10.3901/JME.2023.20.215</w:t>
+      </w:r>
+    </w:p>
+    <w:p>
+      <w:r>
+        <w:t>[27] 牟建鹏, 刘文韬, 熊伟丽. 基于双向生成对抗网络的工业过程故障检测[J/OL]. 智能系统学报, 2024, 19(5): 1199-1208[2026-06-11]. https://html.rhhz.net/tis/html/202306011.htm</w:t>
+      </w:r>
+    </w:p>
+    <w:p>
+      <w:r>
+        <w:t>[28] XU J, WU H, WANG J, et al. Anomaly Transformer: Time Series Anomaly Detection with Association Discrepancy[C/OL]//International Conference on Learning Representations. 2022[2026-06-11]. https://openreview.net/forum?id=LzQQ89U1qm_</w:t>
+      </w:r>
+    </w:p>
+    <w:p>
+      <w:r>
+        <w:t>[29] TULI S, CASALE G, JENNINGS N R. TranAD: Deep Transformer Networks for Anomaly Detection in Multivariate Time Series Data[J/OL]. Proceedings of the VLDB Endowment, 2022[2026-06-11]. https://www.vldb.org/pvldb/vol15/p1201-tuli.pdf</w:t>
+      </w:r>
+    </w:p>
+    <w:p>
+      <w:r>
+        <w:t>[30] YANG Y, ZHANG C, ZHOU T, et al. DCdetector: Dual Attention Contrastive Representation Learning for Time Series Anomaly Detection[C/OL]//ACM SIGKDD Conference on Knowledge Discovery and Data Mining. 2023[2026-06-11]. https://arxiv.org/abs/2306.10347</w:t>
+      </w:r>
+    </w:p>
+    <w:p>
+      <w:r>
+        <w:t>[31] KLOETERGENS J, TALEBZADEH S, PATIL V, et al. CircuITS: Probabilistic Circuits for Irregular Multivariate Time Series Forecasting[EB/OL]. arXiv:2605.01764, 2026[2026-06-11]. https://arxiv.org/abs/2605.01764</w:t>
       </w:r>
     </w:p>
     <w:p>

</xml_diff>